<commit_message>
Resume: shorter Linux kernel entry, Lisbon address; refresh root CV copies; remove leftover server files
- resume/: rebuilt from jeremycochoy/resume (Linux kernel: « Contribution to the ext2 filesystem. », contact address in Lisbon)
- root index.{md,pdf,txt,docx,tex,tuc,log}: replaced the 2022 CV copies with the current build (index.html untouched)
- removed old-server-ip, zenol-ngnix, techgate-ngnix (leftovers, Jeremy 25.10)

Co-Authored-By: Claude Opus 5.5 <noreply@anthropic.com>
</commit_message>
<xml_diff>
--- a/index.docx
+++ b/index.docx
@@ -56,6 +56,72 @@
         <w:pStyle w:val="DefinitionTerm"/>
       </w:pPr>
       <w:r>
+        <w:t xml:space="preserve">2021-Today</w:t>
+      </w:r>
+    </w:p>
+    <w:p>
+      <w:pPr>
+        <w:pStyle w:val="Definition"/>
+      </w:pPr>
+      <w:r>
+        <w:rPr>
+          <w:i/>
+        </w:rPr>
+        <w:t xml:space="preserve">CEO at Redstone Solutions OÜ</w:t>
+      </w:r>
+    </w:p>
+    <w:p>
+      <w:pPr>
+        <w:pStyle w:val="Definition"/>
+      </w:pPr>
+      <w:r>
+        <w:t xml:space="preserve">Real-time and high-availability solutions. Building advanced generative modeling and simulation technologies.</w:t>
+      </w:r>
+    </w:p>
+    <w:p>
+      <w:pPr>
+        <w:pStyle w:val="DefinitionTerm"/>
+      </w:pPr>
+      <w:r>
+        <w:t xml:space="preserve">2020-2021</w:t>
+      </w:r>
+    </w:p>
+    <w:p>
+      <w:pPr>
+        <w:pStyle w:val="Definition"/>
+      </w:pPr>
+      <w:r>
+        <w:rPr>
+          <w:i/>
+        </w:rPr>
+        <w:t xml:space="preserve">ML Consulting</w:t>
+      </w:r>
+    </w:p>
+    <w:p>
+      <w:pPr>
+        <w:pStyle w:val="Definition"/>
+      </w:pPr>
+      <w:r>
+        <w:t xml:space="preserve">Providing machine learning consulting services with a focus on time series forecasting.</w:t>
+      </w:r>
+      <w:r>
+        <w:t xml:space="preserve"> </w:t>
+      </w:r>
+      <w:r>
+        <w:t xml:space="preserve">Expertise includes designing and implementing predictive models using PyTorch, transformers,</w:t>
+      </w:r>
+      <w:r>
+        <w:t xml:space="preserve"> </w:t>
+      </w:r>
+      <w:r>
+        <w:t xml:space="preserve">and recurrent neural network architectures.</w:t>
+      </w:r>
+    </w:p>
+    <w:p>
+      <w:pPr>
+        <w:pStyle w:val="DefinitionTerm"/>
+      </w:pPr>
+      <w:r>
         <w:t xml:space="preserve">2019-2020</w:t>
       </w:r>
     </w:p>
@@ -472,6 +538,23 @@
         <w:t xml:space="preserve">Open Source Contributions</w:t>
       </w:r>
       <w:bookmarkEnd w:id="22"/>
+    </w:p>
+    <w:p>
+      <w:pPr>
+        <w:pStyle w:val="DefinitionTerm"/>
+      </w:pPr>
+      <w:r>
+        <w:t xml:space="preserve">Linux kernel</w:t>
+      </w:r>
+    </w:p>
+    <w:p>
+      <w:pPr>
+        <w:pStyle w:val="Compact"/>
+        <w:pStyle w:val="Definition"/>
+      </w:pPr>
+      <w:r>
+        <w:t xml:space="preserve">Contribution to the ext2 filesystem.</w:t>
+      </w:r>
     </w:p>
     <w:p>
       <w:pPr>
@@ -685,19 +768,25 @@
         <w:pStyle w:val="BlockText"/>
       </w:pPr>
       <w:r>
-        <w:t xml:space="preserve">jeremy.cochoy@gmail.com • +33 6 43 01 74 02 • years old</w:t>
+        <w:t xml:space="preserve">jeremy.cochoy@gmail.com • +33 6 43 01 74 02 • 36 years old</w:t>
       </w:r>
       <w:r>
         <w:br/>
       </w:r>
       <w:r>
-        <w:t xml:space="preserve">43-300 Bielsko-Biala</w:t>
+        <w:t xml:space="preserve">Rua Correia Teles 28 A</w:t>
       </w:r>
       <w:r>
         <w:br/>
       </w:r>
       <w:r>
-        <w:t xml:space="preserve">Poland</w:t>
+        <w:t xml:space="preserve">1350-100 Lisboa</w:t>
+      </w:r>
+      <w:r>
+        <w:br/>
+      </w:r>
+      <w:r>
+        <w:t xml:space="preserve">Portugal</w:t>
       </w:r>
       <w:r>
         <w:br/>

</xml_diff>

<commit_message>
new version Sun Oct 25 15:17:10 CET 2026
</commit_message>
<xml_diff>
--- a/index.docx
+++ b/index.docx
@@ -56,6 +56,72 @@
         <w:pStyle w:val="DefinitionTerm"/>
       </w:pPr>
       <w:r>
+        <w:t xml:space="preserve">2021-Today</w:t>
+      </w:r>
+    </w:p>
+    <w:p>
+      <w:pPr>
+        <w:pStyle w:val="Definition"/>
+      </w:pPr>
+      <w:r>
+        <w:rPr>
+          <w:i/>
+        </w:rPr>
+        <w:t xml:space="preserve">CEO at Redstone Solutions OÜ</w:t>
+      </w:r>
+    </w:p>
+    <w:p>
+      <w:pPr>
+        <w:pStyle w:val="Definition"/>
+      </w:pPr>
+      <w:r>
+        <w:t xml:space="preserve">Real-time and high-availability solutions. Building advanced generative modeling and simulation technologies.</w:t>
+      </w:r>
+    </w:p>
+    <w:p>
+      <w:pPr>
+        <w:pStyle w:val="DefinitionTerm"/>
+      </w:pPr>
+      <w:r>
+        <w:t xml:space="preserve">2020-2021</w:t>
+      </w:r>
+    </w:p>
+    <w:p>
+      <w:pPr>
+        <w:pStyle w:val="Definition"/>
+      </w:pPr>
+      <w:r>
+        <w:rPr>
+          <w:i/>
+        </w:rPr>
+        <w:t xml:space="preserve">ML Consulting</w:t>
+      </w:r>
+    </w:p>
+    <w:p>
+      <w:pPr>
+        <w:pStyle w:val="Definition"/>
+      </w:pPr>
+      <w:r>
+        <w:t xml:space="preserve">Providing machine learning consulting services with a focus on time series forecasting.</w:t>
+      </w:r>
+      <w:r>
+        <w:t xml:space="preserve"> </w:t>
+      </w:r>
+      <w:r>
+        <w:t xml:space="preserve">Expertise includes designing and implementing predictive models using PyTorch, transformers,</w:t>
+      </w:r>
+      <w:r>
+        <w:t xml:space="preserve"> </w:t>
+      </w:r>
+      <w:r>
+        <w:t xml:space="preserve">and recurrent neural network architectures.</w:t>
+      </w:r>
+    </w:p>
+    <w:p>
+      <w:pPr>
+        <w:pStyle w:val="DefinitionTerm"/>
+      </w:pPr>
+      <w:r>
         <w:t xml:space="preserve">2019-2020</w:t>
       </w:r>
     </w:p>
@@ -472,6 +538,23 @@
         <w:t xml:space="preserve">Open Source Contributions</w:t>
       </w:r>
       <w:bookmarkEnd w:id="22"/>
+    </w:p>
+    <w:p>
+      <w:pPr>
+        <w:pStyle w:val="DefinitionTerm"/>
+      </w:pPr>
+      <w:r>
+        <w:t xml:space="preserve">Linux kernel</w:t>
+      </w:r>
+    </w:p>
+    <w:p>
+      <w:pPr>
+        <w:pStyle w:val="Compact"/>
+        <w:pStyle w:val="Definition"/>
+      </w:pPr>
+      <w:r>
+        <w:t xml:space="preserve">Contribution to the ext2 filesystem.</w:t>
+      </w:r>
     </w:p>
     <w:p>
       <w:pPr>
@@ -685,19 +768,25 @@
         <w:pStyle w:val="BlockText"/>
       </w:pPr>
       <w:r>
-        <w:t xml:space="preserve">jeremy.cochoy@gmail.com • +33 6 43 01 74 02 • years old</w:t>
+        <w:t xml:space="preserve">jeremy.cochoy@gmail.com • +33 6 43 01 74 02 • 36 years old</w:t>
       </w:r>
       <w:r>
         <w:br/>
       </w:r>
       <w:r>
-        <w:t xml:space="preserve">43-300 Bielsko-Biala</w:t>
+        <w:t xml:space="preserve">Rua Correia Teles 28 A</w:t>
       </w:r>
       <w:r>
         <w:br/>
       </w:r>
       <w:r>
-        <w:t xml:space="preserve">Poland</w:t>
+        <w:t xml:space="preserve">1350-100 Lisboa</w:t>
+      </w:r>
+      <w:r>
+        <w:br/>
+      </w:r>
+      <w:r>
+        <w:t xml:space="preserve">Portugal</w:t>
       </w:r>
       <w:r>
         <w:br/>

</xml_diff>